<commit_message>
Add Alight Technologies strong-point enhancements to the letter.
The request and the manager draft now name Alight Technologies and list the BOT enhancements delivered there.

Co-authored-by: Manasa R M <manasa123104@users.noreply.github.com>
</commit_message>
<xml_diff>
--- a/docs/Recommendation_Letter.docx
+++ b/docs/Recommendation_Letter.docx
@@ -4,7 +4,7 @@
   <w:body>
     <w:p>
       <w:pPr>
-        <w:spacing w:before="0" w:after="240"/>
+        <w:spacing w:before="80" w:after="160"/>
       </w:pPr>
       <w:r>
         <w:rPr>
@@ -18,7 +18,7 @@
     </w:p>
     <w:p>
       <w:pPr>
-        <w:spacing w:after="40"/>
+        <w:spacing w:after="160" w:before="0"/>
       </w:pPr>
       <w:r>
         <w:rPr>
@@ -26,23 +26,17 @@
           <w:b/>
           <w:sz w:val="24"/>
         </w:rPr>
-        <w:t xml:space="preserve">Subject: </w:t>
-      </w:r>
-      <w:r>
-        <w:rPr>
-          <w:rFonts w:ascii="Calibri" w:hAnsi="Calibri"/>
-          <w:sz w:val="24"/>
-        </w:rPr>
-        <w:t>Recommendation letter request — BOT</w:t>
+        <w:t>Subject: Recommendation letter — BOT work at Alight Technologies</w:t>
       </w:r>
     </w:p>
     <w:p>
       <w:pPr>
-        <w:spacing w:after="160"/>
+        <w:spacing w:after="80" w:before="0"/>
       </w:pPr>
       <w:r>
         <w:rPr>
           <w:rFonts w:ascii="Calibri" w:hAnsi="Calibri"/>
+          <w:b w:val="0"/>
           <w:sz w:val="24"/>
         </w:rPr>
         <w:t>Dear [Manager’s Name],</w:t>
@@ -50,35 +44,108 @@
     </w:p>
     <w:p>
       <w:pPr>
-        <w:spacing w:after="160"/>
+        <w:spacing w:after="80" w:before="0"/>
+      </w:pPr>
+      <w:r>
+        <w:rPr>
+          <w:rFonts w:ascii="Calibri" w:hAnsi="Calibri"/>
+          <w:b w:val="0"/>
+          <w:sz w:val="24"/>
+        </w:rPr>
+        <w:t>Could you write a short recommendation letter for me based on my work at Alight Technologies on BOT, the agentic AI chatbot? These are the strong-point enhancements I delivered:</w:t>
+      </w:r>
+    </w:p>
+    <w:p>
+      <w:pPr>
+        <w:pStyle w:val="ListBullet"/>
+        <w:spacing w:after="40" w:before="0"/>
+        <w:ind w:left="504"/>
       </w:pPr>
       <w:r>
         <w:rPr>
           <w:rFonts w:ascii="Calibri" w:hAnsi="Calibri"/>
           <w:sz w:val="24"/>
         </w:rPr>
-        <w:t>Could you write a short recommendation letter for me based on my work on BOT, the agentic AI chatbot?</w:t>
+        <w:t>Six-stage pipeline (Business Analyst, Developer, Tester, Data Analyst, Deploy, Trainer) that can run one stage or the full chain from an uploaded file or a GitHub repository.</w:t>
       </w:r>
     </w:p>
     <w:p>
       <w:pPr>
-        <w:spacing w:after="160"/>
+        <w:pStyle w:val="ListBullet"/>
+        <w:spacing w:after="40" w:before="0"/>
+        <w:ind w:left="504"/>
       </w:pPr>
       <w:r>
         <w:rPr>
           <w:rFonts w:ascii="Calibri" w:hAnsi="Calibri"/>
           <w:sz w:val="24"/>
         </w:rPr>
-        <w:t>I built the six-stage pipeline (Business Analyst through Trainer), the repository-scale code converter, and the hosting and safety enhancements around it. A one-paragraph draft is below if that saves you time.</w:t>
+        <w:t>Repository-scale code converter with business-logic notes, large-file handling, and push of the result to a GitHub branch.</w:t>
       </w:r>
     </w:p>
     <w:p>
       <w:pPr>
-        <w:spacing w:after="40"/>
+        <w:pStyle w:val="ListBullet"/>
+        <w:spacing w:after="40" w:before="0"/>
+        <w:ind w:left="504"/>
       </w:pPr>
       <w:r>
         <w:rPr>
           <w:rFonts w:ascii="Calibri" w:hAnsi="Calibri"/>
+          <w:sz w:val="24"/>
+        </w:rPr>
+        <w:t>Data Analyst charts numbered on every graph, with PNG and SVG download on a white background.</w:t>
+      </w:r>
+    </w:p>
+    <w:p>
+      <w:pPr>
+        <w:pStyle w:val="ListBullet"/>
+        <w:spacing w:after="40" w:before="0"/>
+        <w:ind w:left="504"/>
+      </w:pPr>
+      <w:r>
+        <w:rPr>
+          <w:rFonts w:ascii="Calibri" w:hAnsi="Calibri"/>
+          <w:sz w:val="24"/>
+        </w:rPr>
+        <w:t>Previous results, Stop/Resume, and a clearer Home for the converter and stage bots.</w:t>
+      </w:r>
+    </w:p>
+    <w:p>
+      <w:pPr>
+        <w:pStyle w:val="ListBullet"/>
+        <w:spacing w:after="40" w:before="0"/>
+        <w:ind w:left="504"/>
+      </w:pPr>
+      <w:r>
+        <w:rPr>
+          <w:rFonts w:ascii="Calibri" w:hAnsi="Calibri"/>
+          <w:sz w:val="24"/>
+        </w:rPr>
+        <w:t>Safe public hosting (Docker and Render) so each visitor sees only their own jobs, plus an MCP endpoint other agents can call.</w:t>
+      </w:r>
+    </w:p>
+    <w:p>
+      <w:pPr>
+        <w:spacing w:after="80" w:before="120"/>
+      </w:pPr>
+      <w:r>
+        <w:rPr>
+          <w:rFonts w:ascii="Calibri" w:hAnsi="Calibri"/>
+          <w:b w:val="0"/>
+          <w:sz w:val="24"/>
+        </w:rPr>
+        <w:t>A one-paragraph draft is below if that saves you time.</w:t>
+      </w:r>
+    </w:p>
+    <w:p>
+      <w:pPr>
+        <w:spacing w:after="40" w:before="0"/>
+      </w:pPr>
+      <w:r>
+        <w:rPr>
+          <w:rFonts w:ascii="Calibri" w:hAnsi="Calibri"/>
+          <w:b w:val="0"/>
           <w:sz w:val="24"/>
         </w:rPr>
         <w:t>Thank you,</w:t>
@@ -86,20 +153,20 @@
     </w:p>
     <w:p>
       <w:pPr>
-        <w:spacing w:after="0"/>
+        <w:spacing w:after="200" w:before="0"/>
       </w:pPr>
       <w:r>
         <w:rPr>
           <w:rFonts w:ascii="Calibri" w:hAnsi="Calibri"/>
+          <w:b w:val="0"/>
           <w:sz w:val="24"/>
         </w:rPr>
-        <w:t>[Your Name]</w:t>
+        <w:t>Manasa R M</w:t>
       </w:r>
     </w:p>
-    <w:p/>
     <w:p>
       <w:pPr>
-        <w:spacing w:before="0" w:after="240"/>
+        <w:spacing w:before="80" w:after="160"/>
       </w:pPr>
       <w:r>
         <w:rPr>
@@ -113,11 +180,12 @@
     </w:p>
     <w:p>
       <w:pPr>
-        <w:spacing w:after="240"/>
+        <w:spacing w:after="160" w:before="0"/>
       </w:pPr>
       <w:r>
         <w:rPr>
           <w:rFonts w:ascii="Calibri" w:hAnsi="Calibri"/>
+          <w:b w:val="0"/>
           <w:sz w:val="24"/>
         </w:rPr>
         <w:t>[Date]</w:t>
@@ -125,23 +193,25 @@
     </w:p>
     <w:p>
       <w:pPr>
-        <w:spacing w:after="160"/>
+        <w:spacing w:after="80" w:before="0"/>
       </w:pPr>
       <w:r>
         <w:rPr>
           <w:rFonts w:ascii="Calibri" w:hAnsi="Calibri"/>
+          <w:b w:val="0"/>
           <w:sz w:val="24"/>
         </w:rPr>
-        <w:t>I recommend [Your Name] for [his/her/their] work on BOT, an agentic AI system. [He/She/They] built a six-stage pipeline that takes a prompt from analysis through code, tests, analytics, and deployment, plus a code converter that handles whole repositories and can publish the result. The work is practical, well structured, and ready to run and host. I recommend [Your Name] without reservation.</w:t>
+        <w:t>I recommend Manasa R M for her work at Alight Technologies on BOT, an agentic AI system. She built a six-stage pipeline from analysis through code, tests, analytics, and deployment, and a code converter that handles whole repositories. Strong-point enhancements include running each stage on its own from uploaded files or GitHub, business-logic output and branch push, numbered Data Analyst charts with PNG and SVG download, saved previous results, and a hosted setup that keeps each visitor’s jobs separate. The work is practical, well structured, and ready to run. I recommend her without reservation.</w:t>
       </w:r>
     </w:p>
     <w:p>
       <w:pPr>
-        <w:spacing w:after="40"/>
+        <w:spacing w:after="40" w:before="160"/>
       </w:pPr>
       <w:r>
         <w:rPr>
           <w:rFonts w:ascii="Calibri" w:hAnsi="Calibri"/>
+          <w:b w:val="0"/>
           <w:sz w:val="24"/>
         </w:rPr>
         <w:t>Sincerely,</w:t>
@@ -149,11 +219,12 @@
     </w:p>
     <w:p>
       <w:pPr>
-        <w:spacing w:after="0"/>
+        <w:spacing w:after="0" w:before="0"/>
       </w:pPr>
       <w:r>
         <w:rPr>
           <w:rFonts w:ascii="Calibri" w:hAnsi="Calibri"/>
+          <w:b w:val="0"/>
           <w:sz w:val="24"/>
         </w:rPr>
         <w:t>[Manager’s Name]</w:t>
@@ -161,19 +232,20 @@
     </w:p>
     <w:p>
       <w:pPr>
-        <w:spacing w:after="0"/>
+        <w:spacing w:after="0" w:before="0"/>
       </w:pPr>
       <w:r>
         <w:rPr>
           <w:rFonts w:ascii="Calibri" w:hAnsi="Calibri"/>
+          <w:b w:val="0"/>
           <w:sz w:val="24"/>
         </w:rPr>
-        <w:t>[Title], [Company]</w:t>
+        <w:t>[Title], Alight Technologies</w:t>
       </w:r>
     </w:p>
     <w:sectPr>
       <w:pgSz w:w="12240" w:h="15840"/>
-      <w:pgMar w:top="1440" w:right="1440" w:bottom="1440" w:left="1440" w:header="720" w:footer="720" w:gutter="0"/>
+      <w:pgMar w:top="1296" w:right="1440" w:bottom="1296" w:left="1440" w:header="720" w:footer="720" w:gutter="0"/>
       <w:cols w:space="720"/>
       <w:docGrid w:linePitch="360"/>
     </w:sectPr>
@@ -545,7 +617,7 @@
     <w:qFormat/>
     <w:rsid w:val="00FC693F"/>
     <w:pPr>
-      <w:spacing w:after="160" w:before="0"/>
+      <w:spacing w:after="120" w:before="0"/>
     </w:pPr>
     <w:rPr>
       <w:rFonts w:ascii="Calibri" w:hAnsi="Calibri"/>

</xml_diff>

<commit_message>
Date the recommendation letter from January through October 2026.
The note now states that period and lists BOT strong points with the dates recorded in the project, 18 September through 23 October 2026.

Co-authored-by: Manasa R M <manasa123104@users.noreply.github.com>
</commit_message>
<xml_diff>
--- a/docs/Recommendation_Letter.docx
+++ b/docs/Recommendation_Letter.docx
@@ -4,7 +4,7 @@
   <w:body>
     <w:p>
       <w:pPr>
-        <w:spacing w:before="80" w:after="160"/>
+        <w:spacing w:before="40" w:after="160"/>
       </w:pPr>
       <w:r>
         <w:rPr>
@@ -26,7 +26,7 @@
           <w:b/>
           <w:sz w:val="24"/>
         </w:rPr>
-        <w:t>Subject: Recommendation letter — BOT work at Alight Technologies</w:t>
+        <w:t>Subject: Recommendation letter — Alight Technologies, January 2026 to October 2026</w:t>
       </w:r>
     </w:p>
     <w:p>
@@ -52,7 +52,20 @@
           <w:b w:val="0"/>
           <w:sz w:val="24"/>
         </w:rPr>
-        <w:t>Could you write a short recommendation letter for me based on my work at Alight Technologies on BOT, the agentic AI chatbot? These are the strong-point enhancements I delivered:</w:t>
+        <w:t>Could you write a short recommendation letter for my work at Alight Technologies from January 2026 to October 2026?</w:t>
+      </w:r>
+    </w:p>
+    <w:p>
+      <w:pPr>
+        <w:spacing w:after="80" w:before="0"/>
+      </w:pPr>
+      <w:r>
+        <w:rPr>
+          <w:rFonts w:ascii="Calibri" w:hAnsi="Calibri"/>
+          <w:b w:val="0"/>
+          <w:sz w:val="24"/>
+        </w:rPr>
+        <w:t>I checked this system for a strong-point letter. This note is the one on file. The BOT project record runs from 18 September 2026 to 23 October 2026. Strong-point enhancements, with dates:</w:t>
       </w:r>
     </w:p>
     <w:p>
@@ -66,7 +79,7 @@
           <w:rFonts w:ascii="Calibri" w:hAnsi="Calibri"/>
           <w:sz w:val="24"/>
         </w:rPr>
-        <w:t>Six-stage pipeline (Business Analyst, Developer, Tester, Data Analyst, Deploy, Trainer) that can run one stage or the full chain from an uploaded file or a GitHub repository.</w:t>
+        <w:t>18 September 2026 — Started the agentic AI chatbot as a multi-bot pipeline.</w:t>
       </w:r>
     </w:p>
     <w:p>
@@ -80,7 +93,7 @@
           <w:rFonts w:ascii="Calibri" w:hAnsi="Calibri"/>
           <w:sz w:val="24"/>
         </w:rPr>
-        <w:t>Repository-scale code converter with business-logic notes, large-file handling, and push of the result to a GitHub branch.</w:t>
+        <w:t>20–24 September 2026 — Added chat history, theme sites, instruction-based editing, and the BOT rebrand with a user-story and Java code viewer.</w:t>
       </w:r>
     </w:p>
     <w:p>
@@ -94,7 +107,7 @@
           <w:rFonts w:ascii="Calibri" w:hAnsi="Calibri"/>
           <w:sz w:val="24"/>
         </w:rPr>
-        <w:t>Data Analyst charts numbered on every graph, with PNG and SVG download on a white background.</w:t>
+        <w:t>13–15 October 2026 — Added the repository-scale code converter, the stage pipeline, business-logic downloads, GitHub push, and public hosting with each visitor’s jobs kept separate.</w:t>
       </w:r>
     </w:p>
     <w:p>
@@ -108,7 +121,7 @@
           <w:rFonts w:ascii="Calibri" w:hAnsi="Calibri"/>
           <w:sz w:val="24"/>
         </w:rPr>
-        <w:t>Previous results, Stop/Resume, and a clearer Home for the converter and stage bots.</w:t>
+        <w:t>16 October 2026 — Added the Data Analyst stage, the MCP endpoint other agents can call, Stop/Resume, and mobile-friendly pages.</w:t>
       </w:r>
     </w:p>
     <w:p>
@@ -122,7 +135,7 @@
           <w:rFonts w:ascii="Calibri" w:hAnsi="Calibri"/>
           <w:sz w:val="24"/>
         </w:rPr>
-        <w:t>Safe public hosting (Docker and Render) so each visitor sees only their own jobs, plus an MCP endpoint other agents can call.</w:t>
+        <w:t>20–23 October 2026 — Saved previous results, numbered every Data Analyst chart with PNG and SVG download, and let each stage run on its own from an uploaded file or GitHub.</w:t>
       </w:r>
     </w:p>
     <w:p>
@@ -135,7 +148,7 @@
           <w:b w:val="0"/>
           <w:sz w:val="24"/>
         </w:rPr>
-        <w:t>A one-paragraph draft is below if that saves you time.</w:t>
+        <w:t>A draft is below. There is no separate strong-point letter on this system for January 2026 through mid-September 2026.</w:t>
       </w:r>
     </w:p>
     <w:p>
@@ -153,7 +166,7 @@
     </w:p>
     <w:p>
       <w:pPr>
-        <w:spacing w:after="200" w:before="0"/>
+        <w:spacing w:after="160" w:before="0"/>
       </w:pPr>
       <w:r>
         <w:rPr>
@@ -166,7 +179,7 @@
     </w:p>
     <w:p>
       <w:pPr>
-        <w:spacing w:before="80" w:after="160"/>
+        <w:spacing w:before="40" w:after="160"/>
       </w:pPr>
       <w:r>
         <w:rPr>
@@ -188,7 +201,7 @@
           <w:b w:val="0"/>
           <w:sz w:val="24"/>
         </w:rPr>
-        <w:t>[Date]</w:t>
+        <w:t>26 October 2026</w:t>
       </w:r>
     </w:p>
     <w:p>
@@ -201,7 +214,90 @@
           <w:b w:val="0"/>
           <w:sz w:val="24"/>
         </w:rPr>
-        <w:t>I recommend Manasa R M for her work at Alight Technologies on BOT, an agentic AI system. She built a six-stage pipeline from analysis through code, tests, analytics, and deployment, and a code converter that handles whole repositories. Strong-point enhancements include running each stage on its own from uploaded files or GitHub, business-logic output and branch push, numbered Data Analyst charts with PNG and SVG download, saved previous results, and a hosted setup that keeps each visitor’s jobs separate. The work is practical, well structured, and ready to run. I recommend her without reservation.</w:t>
+        <w:t>I recommend Manasa R M for her work at Alight Technologies from January 2026 to October 2026 on BOT, an agentic AI system. In the project record, from 18 September 2026 through 23 October 2026, she delivered these strong-point enhancements:</w:t>
+      </w:r>
+    </w:p>
+    <w:p>
+      <w:pPr>
+        <w:pStyle w:val="ListBullet"/>
+        <w:spacing w:after="40" w:before="0"/>
+        <w:ind w:left="504"/>
+      </w:pPr>
+      <w:r>
+        <w:rPr>
+          <w:rFonts w:ascii="Calibri" w:hAnsi="Calibri"/>
+          <w:sz w:val="24"/>
+        </w:rPr>
+        <w:t>18 September 2026 — Built the agentic multi-bot chatbot.</w:t>
+      </w:r>
+    </w:p>
+    <w:p>
+      <w:pPr>
+        <w:pStyle w:val="ListBullet"/>
+        <w:spacing w:after="40" w:before="0"/>
+        <w:ind w:left="504"/>
+      </w:pPr>
+      <w:r>
+        <w:rPr>
+          <w:rFonts w:ascii="Calibri" w:hAnsi="Calibri"/>
+          <w:sz w:val="24"/>
+        </w:rPr>
+        <w:t>20–24 September 2026 — Added chat history, themed sites, instruction-based editing, and a user-story and code viewer.</w:t>
+      </w:r>
+    </w:p>
+    <w:p>
+      <w:pPr>
+        <w:pStyle w:val="ListBullet"/>
+        <w:spacing w:after="40" w:before="0"/>
+        <w:ind w:left="504"/>
+      </w:pPr>
+      <w:r>
+        <w:rPr>
+          <w:rFonts w:ascii="Calibri" w:hAnsi="Calibri"/>
+          <w:sz w:val="24"/>
+        </w:rPr>
+        <w:t>13–15 October 2026 — Shipped the code converter, stage pipeline, business-logic output, GitHub push, and safe public hosting.</w:t>
+      </w:r>
+    </w:p>
+    <w:p>
+      <w:pPr>
+        <w:pStyle w:val="ListBullet"/>
+        <w:spacing w:after="40" w:before="0"/>
+        <w:ind w:left="504"/>
+      </w:pPr>
+      <w:r>
+        <w:rPr>
+          <w:rFonts w:ascii="Calibri" w:hAnsi="Calibri"/>
+          <w:sz w:val="24"/>
+        </w:rPr>
+        <w:t>16 October 2026 — Added Data Analyst, an MCP endpoint, Stop/Resume, and mobile-friendly pages.</w:t>
+      </w:r>
+    </w:p>
+    <w:p>
+      <w:pPr>
+        <w:pStyle w:val="ListBullet"/>
+        <w:spacing w:after="40" w:before="0"/>
+        <w:ind w:left="504"/>
+      </w:pPr>
+      <w:r>
+        <w:rPr>
+          <w:rFonts w:ascii="Calibri" w:hAnsi="Calibri"/>
+          <w:sz w:val="24"/>
+        </w:rPr>
+        <w:t>20–23 October 2026 — Added previous results, numbered charts with PNG and SVG download, and stages that run alone from an upload or GitHub.</w:t>
+      </w:r>
+    </w:p>
+    <w:p>
+      <w:pPr>
+        <w:spacing w:after="80" w:before="120"/>
+      </w:pPr>
+      <w:r>
+        <w:rPr>
+          <w:rFonts w:ascii="Calibri" w:hAnsi="Calibri"/>
+          <w:b w:val="0"/>
+          <w:sz w:val="24"/>
+        </w:rPr>
+        <w:t>The work is practical, well structured, and ready to run. I recommend her without reservation.</w:t>
       </w:r>
     </w:p>
     <w:p>
@@ -245,7 +341,7 @@
     </w:p>
     <w:sectPr>
       <w:pgSz w:w="12240" w:h="15840"/>
-      <w:pgMar w:top="1296" w:right="1440" w:bottom="1296" w:left="1440" w:header="720" w:footer="720" w:gutter="0"/>
+      <w:pgMar w:top="1224" w:right="1440" w:bottom="1224" w:left="1440" w:header="720" w:footer="720" w:gutter="0"/>
       <w:cols w:space="720"/>
       <w:docGrid w:linePitch="360"/>
     </w:sectPr>

</xml_diff>